<commit_message>
Tighten QMH pre-read: drop duplicate treatment-pattern section
Co-authored-by: jackiechow4567-arch <jackiechow4567-arch@users.noreply.github.com>
</commit_message>
<xml_diff>
--- a/artifacts/documents/2026-08-19-qmh-pi-pre-read.docx
+++ b/artifacts/documents/2026-08-19-qmh-pi-pre-read.docx
@@ -677,7 +677,7 @@
               <w:rPr>
                 <w:sz w:val="18"/>
               </w:rPr>
-              <w:t>Treatment</w:t>
+              <w:t>Treatment and related interventions</w:t>
             </w:r>
           </w:p>
         </w:tc>
@@ -690,7 +690,7 @@
               <w:rPr>
                 <w:sz w:val="18"/>
               </w:rPr>
-              <w:t>Drug, dose, start/stop dates, sequence</w:t>
+              <w:t>Cytoreductive drugs, dose, start/stop dates, sequences; phlebotomy / RBC support; JAK inhibitors; transplantation</w:t>
             </w:r>
           </w:p>
         </w:tc>
@@ -703,134 +703,7 @@
               <w:rPr>
                 <w:sz w:val="18"/>
               </w:rPr>
-            </w:r>
-          </w:p>
-        </w:tc>
-        <w:tc>
-          <w:tcPr>
-            <w:tcW w:type="dxa" w:w="1930"/>
-          </w:tcPr>
-          <w:p>
-            <w:r>
-              <w:rPr>
-                <w:sz w:val="18"/>
-              </w:rPr>
-            </w:r>
-          </w:p>
-        </w:tc>
-        <w:tc>
-          <w:tcPr>
-            <w:tcW w:type="dxa" w:w="1930"/>
-          </w:tcPr>
-          <w:p>
-            <w:r>
-              <w:rPr>
-                <w:sz w:val="18"/>
-              </w:rPr>
-            </w:r>
-          </w:p>
-        </w:tc>
-      </w:tr>
-      <w:tr>
-        <w:tc>
-          <w:tcPr>
-            <w:tcW w:type="dxa" w:w="1930"/>
-          </w:tcPr>
-          <w:p>
-            <w:r>
-              <w:rPr>
-                <w:sz w:val="18"/>
-              </w:rPr>
-              <w:t>Supportive care</w:t>
-            </w:r>
-          </w:p>
-        </w:tc>
-        <w:tc>
-          <w:tcPr>
-            <w:tcW w:type="dxa" w:w="1930"/>
-          </w:tcPr>
-          <w:p>
-            <w:r>
-              <w:rPr>
-                <w:sz w:val="18"/>
-              </w:rPr>
-              <w:t>Phlebotomy, RBC transfusion</w:t>
-            </w:r>
-          </w:p>
-        </w:tc>
-        <w:tc>
-          <w:tcPr>
-            <w:tcW w:type="dxa" w:w="1930"/>
-          </w:tcPr>
-          <w:p>
-            <w:r>
-              <w:rPr>
-                <w:sz w:val="18"/>
-              </w:rPr>
-            </w:r>
-          </w:p>
-        </w:tc>
-        <w:tc>
-          <w:tcPr>
-            <w:tcW w:type="dxa" w:w="1930"/>
-          </w:tcPr>
-          <w:p>
-            <w:r>
-              <w:rPr>
-                <w:sz w:val="18"/>
-              </w:rPr>
-            </w:r>
-          </w:p>
-        </w:tc>
-        <w:tc>
-          <w:tcPr>
-            <w:tcW w:type="dxa" w:w="1930"/>
-          </w:tcPr>
-          <w:p>
-            <w:r>
-              <w:rPr>
-                <w:sz w:val="18"/>
-              </w:rPr>
-            </w:r>
-          </w:p>
-        </w:tc>
-      </w:tr>
-      <w:tr>
-        <w:tc>
-          <w:tcPr>
-            <w:tcW w:type="dxa" w:w="1930"/>
-          </w:tcPr>
-          <w:p>
-            <w:r>
-              <w:rPr>
-                <w:sz w:val="18"/>
-              </w:rPr>
-              <w:t>Other interventions</w:t>
-            </w:r>
-          </w:p>
-        </w:tc>
-        <w:tc>
-          <w:tcPr>
-            <w:tcW w:type="dxa" w:w="1930"/>
-          </w:tcPr>
-          <w:p>
-            <w:r>
-              <w:rPr>
-                <w:sz w:val="18"/>
-              </w:rPr>
-              <w:t>JAK inhibitors, transplantation</w:t>
-            </w:r>
-          </w:p>
-        </w:tc>
-        <w:tc>
-          <w:tcPr>
-            <w:tcW w:type="dxa" w:w="1930"/>
-          </w:tcPr>
-          <w:p>
-            <w:r>
-              <w:rPr>
-                <w:sz w:val="18"/>
-              </w:rPr>
+              <w:t>Clinic letters / notes</w:t>
             </w:r>
           </w:p>
         </w:tc>
@@ -1239,59 +1112,13 @@
     </w:p>
     <w:p>
       <w:pPr>
-        <w:pStyle w:val="Heading2"/>
-      </w:pPr>
-      <w:r>
-        <w:t>1.4 Treatment patterns</w:t>
-      </w:r>
-    </w:p>
-    <w:p>
-      <w:r>
-        <w:t>Are treatment patterns and related interventions captured in a structured way, for example:</w:t>
-      </w:r>
-    </w:p>
-    <w:p>
-      <w:pPr>
         <w:pStyle w:val="ListBullet"/>
       </w:pPr>
       <w:r>
         <w:rPr>
           <w:sz w:val="20"/>
         </w:rPr>
-        <w:t>Cytoreductive sequences</w:t>
-      </w:r>
-    </w:p>
-    <w:p>
-      <w:pPr>
-        <w:pStyle w:val="ListBullet"/>
-      </w:pPr>
-      <w:r>
-        <w:rPr>
-          <w:sz w:val="20"/>
-        </w:rPr>
-        <w:t>Phlebotomy / RBC support</w:t>
-      </w:r>
-    </w:p>
-    <w:p>
-      <w:pPr>
-        <w:pStyle w:val="ListBullet"/>
-      </w:pPr>
-      <w:r>
-        <w:rPr>
-          <w:sz w:val="20"/>
-        </w:rPr>
-        <w:t>JAK inhibitors</w:t>
-      </w:r>
-    </w:p>
-    <w:p>
-      <w:pPr>
-        <w:pStyle w:val="ListBullet"/>
-      </w:pPr>
-      <w:r>
-        <w:rPr>
-          <w:sz w:val="20"/>
-        </w:rPr>
-        <w:t>Transplantation</w:t>
+        <w:t>For treatment: if a drug or intervention is recorded, can start/stop dates and sequences (line of therapy, switches) be reconstructed, or is it mainly the current regimen?</w:t>
       </w:r>
     </w:p>
     <w:p>

</xml_diff>